<commit_message>
added all the task and challenge documents
</commit_message>
<xml_diff>
--- a/shellscript-02.docx
+++ b/shellscript-02.docx
@@ -828,12 +828,21 @@
         </w:rPr>
         <w:t xml:space="preserve">Script to install </w:t>
       </w:r>
-      <w:r>
-        <w:rPr>
-          <w:sz w:val="28"/>
-          <w:szCs w:val="28"/>
-        </w:rPr>
-        <w:t>apache tomcat on ec2 server:</w:t>
+      <w:proofErr w:type="spellStart"/>
+      <w:r>
+        <w:rPr>
+          <w:sz w:val="28"/>
+          <w:szCs w:val="28"/>
+        </w:rPr>
+        <w:t>apache</w:t>
+      </w:r>
+      <w:proofErr w:type="spellEnd"/>
+      <w:r>
+        <w:rPr>
+          <w:sz w:val="28"/>
+          <w:szCs w:val="28"/>
+        </w:rPr>
+        <w:t xml:space="preserve"> tomcat on ec2 server:</w:t>
       </w:r>
     </w:p>
     <w:p>
@@ -1739,8 +1748,18 @@
           <w:sz w:val="28"/>
           <w:szCs w:val="28"/>
         </w:rPr>
-        <w:t>Bash script to monitor cpu</w:t>
-      </w:r>
+        <w:t xml:space="preserve">Bash script to monitor </w:t>
+      </w:r>
+      <w:proofErr w:type="spellStart"/>
+      <w:proofErr w:type="gramStart"/>
+      <w:r>
+        <w:rPr>
+          <w:sz w:val="28"/>
+          <w:szCs w:val="28"/>
+        </w:rPr>
+        <w:t>cpu</w:t>
+      </w:r>
+      <w:proofErr w:type="spellEnd"/>
       <w:r>
         <w:rPr>
           <w:sz w:val="28"/>
@@ -1755,6 +1774,7 @@
         </w:rPr>
         <w:t>:</w:t>
       </w:r>
+      <w:proofErr w:type="gramEnd"/>
       <w:r>
         <w:rPr>
           <w:sz w:val="28"/>
@@ -1926,7 +1946,23 @@
           <w:sz w:val="24"/>
           <w:szCs w:val="24"/>
         </w:rPr>
-        <w:t xml:space="preserve">Configuring my email in my mail.rc file </w:t>
+        <w:t xml:space="preserve">Configuring my email in my </w:t>
+      </w:r>
+      <w:proofErr w:type="spellStart"/>
+      <w:r>
+        <w:rPr>
+          <w:sz w:val="24"/>
+          <w:szCs w:val="24"/>
+        </w:rPr>
+        <w:t>mail.rc</w:t>
+      </w:r>
+      <w:proofErr w:type="spellEnd"/>
+      <w:r>
+        <w:rPr>
+          <w:sz w:val="24"/>
+          <w:szCs w:val="24"/>
+        </w:rPr>
+        <w:t xml:space="preserve"> file </w:t>
       </w:r>
     </w:p>
     <w:p>
@@ -2496,18 +2532,35 @@
           <w:sz w:val="28"/>
           <w:szCs w:val="28"/>
         </w:rPr>
-        <w:t>Scheduling cronjob for cpu monitor script:</w:t>
-      </w:r>
-    </w:p>
-    <w:p>
-      <w:pPr>
-        <w:rPr>
-          <w:sz w:val="24"/>
-          <w:szCs w:val="24"/>
-        </w:rPr>
-      </w:pPr>
-      <w:r>
-        <w:rPr>
+        <w:t xml:space="preserve">Scheduling cronjob for </w:t>
+      </w:r>
+      <w:proofErr w:type="spellStart"/>
+      <w:r>
+        <w:rPr>
+          <w:sz w:val="28"/>
+          <w:szCs w:val="28"/>
+        </w:rPr>
+        <w:t>cpu</w:t>
+      </w:r>
+      <w:proofErr w:type="spellEnd"/>
+      <w:r>
+        <w:rPr>
+          <w:sz w:val="28"/>
+          <w:szCs w:val="28"/>
+        </w:rPr>
+        <w:t xml:space="preserve"> monitor script:</w:t>
+      </w:r>
+    </w:p>
+    <w:p>
+      <w:pPr>
+        <w:rPr>
+          <w:sz w:val="24"/>
+          <w:szCs w:val="24"/>
+        </w:rPr>
+      </w:pPr>
+      <w:r>
+        <w:rPr>
+          <w:noProof/>
           <w:sz w:val="24"/>
           <w:szCs w:val="24"/>
         </w:rPr>
@@ -2557,6 +2610,7 @@
       </w:pPr>
       <w:r>
         <w:rPr>
+          <w:noProof/>
           <w:sz w:val="24"/>
           <w:szCs w:val="24"/>
         </w:rPr>
@@ -2650,6 +2704,7 @@
       </w:pPr>
       <w:r>
         <w:rPr>
+          <w:noProof/>
           <w:sz w:val="24"/>
           <w:szCs w:val="24"/>
         </w:rPr>
@@ -2715,6 +2770,7 @@
       </w:pPr>
       <w:r>
         <w:rPr>
+          <w:noProof/>
           <w:sz w:val="24"/>
           <w:szCs w:val="24"/>
         </w:rPr>
@@ -2764,6 +2820,7 @@
       </w:pPr>
       <w:r>
         <w:rPr>
+          <w:noProof/>
           <w:sz w:val="24"/>
           <w:szCs w:val="24"/>
         </w:rPr>
@@ -2829,6 +2886,7 @@
       </w:pPr>
       <w:r>
         <w:rPr>
+          <w:noProof/>
           <w:sz w:val="24"/>
           <w:szCs w:val="24"/>
         </w:rPr>
@@ -2886,6 +2944,7 @@
       </w:pPr>
       <w:r>
         <w:rPr>
+          <w:noProof/>
           <w:sz w:val="24"/>
           <w:szCs w:val="24"/>
         </w:rPr>
@@ -2938,18 +2997,51 @@
           <w:sz w:val="24"/>
           <w:szCs w:val="24"/>
         </w:rPr>
-        <w:t>Pushed the Task.docs to Github Remote repository.</w:t>
-      </w:r>
-    </w:p>
-    <w:p>
-      <w:pPr>
-        <w:rPr>
-          <w:sz w:val="24"/>
-          <w:szCs w:val="24"/>
-        </w:rPr>
-      </w:pPr>
-      <w:r>
-        <w:rPr>
+        <w:t xml:space="preserve">Pushed the </w:t>
+      </w:r>
+      <w:proofErr w:type="spellStart"/>
+      <w:r>
+        <w:rPr>
+          <w:sz w:val="24"/>
+          <w:szCs w:val="24"/>
+        </w:rPr>
+        <w:t>Task.docs</w:t>
+      </w:r>
+      <w:proofErr w:type="spellEnd"/>
+      <w:r>
+        <w:rPr>
+          <w:sz w:val="24"/>
+          <w:szCs w:val="24"/>
+        </w:rPr>
+        <w:t xml:space="preserve"> to </w:t>
+      </w:r>
+      <w:proofErr w:type="spellStart"/>
+      <w:r>
+        <w:rPr>
+          <w:sz w:val="24"/>
+          <w:szCs w:val="24"/>
+        </w:rPr>
+        <w:t>Github</w:t>
+      </w:r>
+      <w:proofErr w:type="spellEnd"/>
+      <w:r>
+        <w:rPr>
+          <w:sz w:val="24"/>
+          <w:szCs w:val="24"/>
+        </w:rPr>
+        <w:t xml:space="preserve"> Remote repository.</w:t>
+      </w:r>
+    </w:p>
+    <w:p>
+      <w:pPr>
+        <w:rPr>
+          <w:sz w:val="24"/>
+          <w:szCs w:val="24"/>
+        </w:rPr>
+      </w:pPr>
+      <w:r>
+        <w:rPr>
+          <w:noProof/>
           <w:sz w:val="24"/>
           <w:szCs w:val="24"/>
         </w:rPr>

</xml_diff>